<commit_message>
Índice maestro: añade política de ejemplos visuales con imagen del resultado
Co-Authored-By: Claude Sonnet 5.5 <noreply@anthropic.com>
Claude-Session: https://claude.ai/code/session_01PyYjCzSVNVB9spV1ZtFV65
</commit_message>
<xml_diff>
--- a/manual-bases-de-datos/Manual-Bases-de-Datos-Indice-Maestro.docx
+++ b/manual-bases-de-datos/Manual-Bases-de-Datos-Indice-Maestro.docx
@@ -849,7 +849,7 @@
           <w:sz w:val="22"/>
           <w:szCs w:val="22"/>
         </w:rPr>
-        <w:t xml:space="preserve">Cada concepto del manual se enseñará con la misma plantilla de 11 pasos, para que el alumno entienda lo que hace y no solo copie comandos.</w:t>
+        <w:t xml:space="preserve">Cada concepto del manual se enseñará con la misma plantilla de 12 pasos, para que el alumno entienda lo que hace y no solo copie comandos.</w:t>
       </w:r>
     </w:p>
     <w:p>
@@ -1031,7 +1031,7 @@
           <w:sz w:val="22"/>
           <w:szCs w:val="22"/>
         </w:rPr>
-        <w:t xml:space="preserve">Ejercicio</w:t>
+        <w:t xml:space="preserve">Resultado visual (código junto a una imagen de la interfaz con lo construido)</w:t>
       </w:r>
     </w:p>
     <w:p>
@@ -1057,7 +1057,7 @@
           <w:sz w:val="22"/>
           <w:szCs w:val="22"/>
         </w:rPr>
-        <w:t xml:space="preserve">Solución</w:t>
+        <w:t xml:space="preserve">Ejercicio</w:t>
       </w:r>
     </w:p>
     <w:p>
@@ -1083,7 +1083,7 @@
           <w:sz w:val="22"/>
           <w:szCs w:val="22"/>
         </w:rPr>
-        <w:t xml:space="preserve">Error habitual</w:t>
+        <w:t xml:space="preserve">Solución</w:t>
       </w:r>
     </w:p>
     <w:p>
@@ -1109,7 +1109,7 @@
           <w:sz w:val="22"/>
           <w:szCs w:val="22"/>
         </w:rPr>
-        <w:t xml:space="preserve">Buena práctica</w:t>
+        <w:t xml:space="preserve">Error habitual</w:t>
       </w:r>
     </w:p>
     <w:p>
@@ -1135,20 +1135,69 @@
           <w:sz w:val="22"/>
           <w:szCs w:val="22"/>
         </w:rPr>
-        <w:t xml:space="preserve">Comprobación (cómo verificar que lo hecho funciona)</w:t>
-      </w:r>
-    </w:p>
-    <w:p>
-      <w:pPr>
-        <w:spacing w:after="120" w:line="300"/>
-      </w:pPr>
-      <w:r>
-        <w:rPr>
-          <w:color w:val="222222"/>
+        <w:t xml:space="preserve">Buena práctica</w:t>
+      </w:r>
+    </w:p>
+    <w:p>
+      <w:pPr>
+        <w:tabs>
+          <w:tab w:val="left" w:pos="540"/>
+        </w:tabs>
+        <w:spacing w:after="60"/>
+        <w:ind w:left="540" w:hanging="540"/>
+      </w:pPr>
+      <w:r>
+        <w:rPr>
+          <w:b/>
+          <w:bCs/>
+          <w:color w:val="FF7A1A"/>
           <w:sz w:val="22"/>
           <w:szCs w:val="22"/>
         </w:rPr>
+        <w:t xml:space="preserve">12.	</w:t>
+      </w:r>
+      <w:r>
+        <w:rPr>
+          <w:sz w:val="22"/>
+          <w:szCs w:val="22"/>
+        </w:rPr>
+        <w:t xml:space="preserve">Comprobación (cómo verificar que lo hecho funciona)</w:t>
+      </w:r>
+    </w:p>
+    <w:p>
+      <w:pPr>
+        <w:spacing w:after="120" w:line="300"/>
+      </w:pPr>
+      <w:r>
+        <w:rPr>
+          <w:color w:val="222222"/>
+          <w:sz w:val="22"/>
+          <w:szCs w:val="22"/>
+        </w:rPr>
         <w:t xml:space="preserve">En la Parte 5 (SQL), cada concepto añade además: código completo, resultado esperado y explicación de ese resultado.</w:t>
+      </w:r>
+    </w:p>
+    <w:p>
+      <w:pPr>
+        <w:spacing w:after="120" w:line="300"/>
+      </w:pPr>
+      <w:r>
+        <w:rPr>
+          <w:b/>
+          <w:bCs/>
+          <w:color w:val="222222"/>
+          <w:sz w:val="22"/>
+          <w:szCs w:val="22"/>
+        </w:rPr>
+        <w:t xml:space="preserve">Regla de ejemplos visuales:</w:t>
+      </w:r>
+      <w:r>
+        <w:rPr>
+          <w:color w:val="222222"/>
+          <w:sz w:val="22"/>
+          <w:szCs w:val="22"/>
+        </w:rPr>
+        <w:t xml:space="preserve"> cada ejemplo de cada punto lleva su código y, justo debajo, una imagen de la interfaz con el resultado de lo que se ha construido. Esto incluye tablas, relaciones, consultas, permisos, copias, pantallas de aplicación y flujos de n8n.</w:t>
       </w:r>
     </w:p>
     <w:p>
@@ -1976,6 +2025,921 @@
     </w:p>
     <w:p>
       <w:pPr>
+        <w:pStyle w:val="Heading2"/>
+        <w:keepNext/>
+        <w:pBdr>
+          <w:left w:val="single" w:color="0B1B4D" w:sz="36" w:space="8"/>
+        </w:pBdr>
+        <w:shd w:fill="EEF3FB" w:val="clear"/>
+        <w:spacing w:after="160" w:before="360"/>
+      </w:pPr>
+      <w:r>
+        <w:rPr>
+          <w:b/>
+          <w:bCs/>
+          <w:color w:val="0B1B4D"/>
+          <w:sz w:val="30"/>
+          <w:szCs w:val="30"/>
+        </w:rPr>
+        <w:t xml:space="preserve">Política de ejemplos visuales</w:t>
+      </w:r>
+    </w:p>
+    <w:p>
+      <w:pPr>
+        <w:spacing w:after="120" w:line="300"/>
+      </w:pPr>
+      <w:r>
+        <w:rPr>
+          <w:color w:val="222222"/>
+          <w:sz w:val="22"/>
+          <w:szCs w:val="22"/>
+        </w:rPr>
+        <w:t xml:space="preserve">Cada ejemplo se presenta en tres piezas seguidas: el código completo, la imagen del resultado en la interfaz y una explicación de lo que se ve en la imagen. La imagen es la comprobación de que el alumno ha construido lo mismo.</w:t>
+      </w:r>
+    </w:p>
+    <w:tbl>
+      <w:tblPr>
+        <w:tblW w:type="dxa" w:w="9638"/>
+        <w:tblBorders>
+          <w:top w:val="single" w:color="auto" w:sz="4"/>
+          <w:left w:val="single" w:color="auto" w:sz="4"/>
+          <w:bottom w:val="single" w:color="auto" w:sz="4"/>
+          <w:right w:val="single" w:color="auto" w:sz="4"/>
+          <w:insideH w:val="single" w:color="auto" w:sz="4"/>
+          <w:insideV w:val="single" w:color="auto" w:sz="4"/>
+        </w:tblBorders>
+      </w:tblPr>
+      <w:tblGrid>
+        <w:gridCol w:w="2400"/>
+        <w:gridCol w:w="7238"/>
+      </w:tblGrid>
+      <w:tr>
+        <w:trPr>
+          <w:cantSplit/>
+          <w:tblHeader/>
+        </w:trPr>
+        <w:tc>
+          <w:tcPr>
+            <w:tcW w:type="dxa" w:w="2400"/>
+            <w:tcBorders>
+              <w:top w:val="single" w:color="C9D1E3" w:sz="4"/>
+              <w:left w:val="single" w:color="C9D1E3" w:sz="4"/>
+              <w:bottom w:val="single" w:color="C9D1E3" w:sz="4"/>
+              <w:right w:val="single" w:color="C9D1E3" w:sz="4"/>
+            </w:tcBorders>
+            <w:shd w:fill="0B1B4D" w:val="clear"/>
+            <w:tcMar>
+              <w:top w:type="dxa" w:w="80"/>
+              <w:left w:type="dxa" w:w="120"/>
+              <w:bottom w:type="dxa" w:w="80"/>
+              <w:right w:type="dxa" w:w="120"/>
+            </w:tcMar>
+          </w:tcPr>
+          <w:p>
+            <w:r>
+              <w:rPr>
+                <w:b/>
+                <w:bCs/>
+                <w:color w:val="FFFFFF"/>
+                <w:sz w:val="20"/>
+                <w:szCs w:val="20"/>
+              </w:rPr>
+              <w:t xml:space="preserve">Qué se construye</w:t>
+            </w:r>
+          </w:p>
+        </w:tc>
+        <w:tc>
+          <w:tcPr>
+            <w:tcW w:type="dxa" w:w="7238"/>
+            <w:tcBorders>
+              <w:top w:val="single" w:color="C9D1E3" w:sz="4"/>
+              <w:left w:val="single" w:color="C9D1E3" w:sz="4"/>
+              <w:bottom w:val="single" w:color="C9D1E3" w:sz="4"/>
+              <w:right w:val="single" w:color="C9D1E3" w:sz="4"/>
+            </w:tcBorders>
+            <w:shd w:fill="0B1B4D" w:val="clear"/>
+            <w:tcMar>
+              <w:top w:type="dxa" w:w="80"/>
+              <w:left w:type="dxa" w:w="120"/>
+              <w:bottom w:type="dxa" w:w="80"/>
+              <w:right w:type="dxa" w:w="120"/>
+            </w:tcMar>
+          </w:tcPr>
+          <w:p>
+            <w:r>
+              <w:rPr>
+                <w:b/>
+                <w:bCs/>
+                <w:color w:val="FFFFFF"/>
+                <w:sz w:val="20"/>
+                <w:szCs w:val="20"/>
+              </w:rPr>
+              <w:t xml:space="preserve">Imagen que acompaña</w:t>
+            </w:r>
+          </w:p>
+        </w:tc>
+      </w:tr>
+      <w:tr>
+        <w:trPr>
+          <w:cantSplit/>
+          <w:tblHeader w:val="false"/>
+        </w:trPr>
+        <w:tc>
+          <w:tcPr>
+            <w:tcW w:type="dxa" w:w="2400"/>
+            <w:tcBorders>
+              <w:top w:val="single" w:color="C9D1E3" w:sz="4"/>
+              <w:left w:val="single" w:color="C9D1E3" w:sz="4"/>
+              <w:bottom w:val="single" w:color="C9D1E3" w:sz="4"/>
+              <w:right w:val="single" w:color="C9D1E3" w:sz="4"/>
+            </w:tcBorders>
+            <w:tcMar>
+              <w:top w:type="dxa" w:w="80"/>
+              <w:left w:type="dxa" w:w="120"/>
+              <w:bottom w:type="dxa" w:w="80"/>
+              <w:right w:type="dxa" w:w="120"/>
+            </w:tcMar>
+          </w:tcPr>
+          <w:p>
+            <w:r>
+              <w:rPr>
+                <w:b w:val="false"/>
+                <w:bCs w:val="false"/>
+                <w:color w:val="222222"/>
+                <w:sz w:val="20"/>
+                <w:szCs w:val="20"/>
+              </w:rPr>
+              <w:t xml:space="preserve">Tablas y datos</w:t>
+            </w:r>
+          </w:p>
+        </w:tc>
+        <w:tc>
+          <w:tcPr>
+            <w:tcW w:type="dxa" w:w="7238"/>
+            <w:tcBorders>
+              <w:top w:val="single" w:color="C9D1E3" w:sz="4"/>
+              <w:left w:val="single" w:color="C9D1E3" w:sz="4"/>
+              <w:bottom w:val="single" w:color="C9D1E3" w:sz="4"/>
+              <w:right w:val="single" w:color="C9D1E3" w:sz="4"/>
+            </w:tcBorders>
+            <w:tcMar>
+              <w:top w:type="dxa" w:w="80"/>
+              <w:left w:type="dxa" w:w="120"/>
+              <w:bottom w:type="dxa" w:w="80"/>
+              <w:right w:type="dxa" w:w="120"/>
+            </w:tcMar>
+          </w:tcPr>
+          <w:p>
+            <w:r>
+              <w:rPr>
+                <w:b w:val="false"/>
+                <w:bCs w:val="false"/>
+                <w:color w:val="222222"/>
+                <w:sz w:val="20"/>
+                <w:szCs w:val="20"/>
+              </w:rPr>
+              <w:t xml:space="preserve">Vista de la tabla con sus filas, columnas y tipos, como en un cliente gráfico</w:t>
+            </w:r>
+          </w:p>
+        </w:tc>
+      </w:tr>
+      <w:tr>
+        <w:trPr>
+          <w:cantSplit/>
+          <w:tblHeader w:val="false"/>
+        </w:trPr>
+        <w:tc>
+          <w:tcPr>
+            <w:tcW w:type="dxa" w:w="2400"/>
+            <w:tcBorders>
+              <w:top w:val="single" w:color="C9D1E3" w:sz="4"/>
+              <w:left w:val="single" w:color="C9D1E3" w:sz="4"/>
+              <w:bottom w:val="single" w:color="C9D1E3" w:sz="4"/>
+              <w:right w:val="single" w:color="C9D1E3" w:sz="4"/>
+            </w:tcBorders>
+            <w:shd w:fill="F2F5FB" w:val="clear"/>
+            <w:tcMar>
+              <w:top w:type="dxa" w:w="80"/>
+              <w:left w:type="dxa" w:w="120"/>
+              <w:bottom w:type="dxa" w:w="80"/>
+              <w:right w:type="dxa" w:w="120"/>
+            </w:tcMar>
+          </w:tcPr>
+          <w:p>
+            <w:r>
+              <w:rPr>
+                <w:b w:val="false"/>
+                <w:bCs w:val="false"/>
+                <w:color w:val="222222"/>
+                <w:sz w:val="20"/>
+                <w:szCs w:val="20"/>
+              </w:rPr>
+              <w:t xml:space="preserve">Relaciones y claves</w:t>
+            </w:r>
+          </w:p>
+        </w:tc>
+        <w:tc>
+          <w:tcPr>
+            <w:tcW w:type="dxa" w:w="7238"/>
+            <w:tcBorders>
+              <w:top w:val="single" w:color="C9D1E3" w:sz="4"/>
+              <w:left w:val="single" w:color="C9D1E3" w:sz="4"/>
+              <w:bottom w:val="single" w:color="C9D1E3" w:sz="4"/>
+              <w:right w:val="single" w:color="C9D1E3" w:sz="4"/>
+            </w:tcBorders>
+            <w:shd w:fill="F2F5FB" w:val="clear"/>
+            <w:tcMar>
+              <w:top w:type="dxa" w:w="80"/>
+              <w:left w:type="dxa" w:w="120"/>
+              <w:bottom w:type="dxa" w:w="80"/>
+              <w:right w:type="dxa" w:w="120"/>
+            </w:tcMar>
+          </w:tcPr>
+          <w:p>
+            <w:r>
+              <w:rPr>
+                <w:b w:val="false"/>
+                <w:bCs w:val="false"/>
+                <w:color w:val="222222"/>
+                <w:sz w:val="20"/>
+                <w:szCs w:val="20"/>
+              </w:rPr>
+              <w:t xml:space="preserve">Diagrama entidad-relación con las claves y las líneas de relación</w:t>
+            </w:r>
+          </w:p>
+        </w:tc>
+      </w:tr>
+      <w:tr>
+        <w:trPr>
+          <w:cantSplit/>
+          <w:tblHeader w:val="false"/>
+        </w:trPr>
+        <w:tc>
+          <w:tcPr>
+            <w:tcW w:type="dxa" w:w="2400"/>
+            <w:tcBorders>
+              <w:top w:val="single" w:color="C9D1E3" w:sz="4"/>
+              <w:left w:val="single" w:color="C9D1E3" w:sz="4"/>
+              <w:bottom w:val="single" w:color="C9D1E3" w:sz="4"/>
+              <w:right w:val="single" w:color="C9D1E3" w:sz="4"/>
+            </w:tcBorders>
+            <w:tcMar>
+              <w:top w:type="dxa" w:w="80"/>
+              <w:left w:type="dxa" w:w="120"/>
+              <w:bottom w:type="dxa" w:w="80"/>
+              <w:right w:type="dxa" w:w="120"/>
+            </w:tcMar>
+          </w:tcPr>
+          <w:p>
+            <w:r>
+              <w:rPr>
+                <w:b w:val="false"/>
+                <w:bCs w:val="false"/>
+                <w:color w:val="222222"/>
+                <w:sz w:val="20"/>
+                <w:szCs w:val="20"/>
+              </w:rPr>
+              <w:t xml:space="preserve">Resultado de una consulta SQL</w:t>
+            </w:r>
+          </w:p>
+        </w:tc>
+        <w:tc>
+          <w:tcPr>
+            <w:tcW w:type="dxa" w:w="7238"/>
+            <w:tcBorders>
+              <w:top w:val="single" w:color="C9D1E3" w:sz="4"/>
+              <w:left w:val="single" w:color="C9D1E3" w:sz="4"/>
+              <w:bottom w:val="single" w:color="C9D1E3" w:sz="4"/>
+              <w:right w:val="single" w:color="C9D1E3" w:sz="4"/>
+            </w:tcBorders>
+            <w:tcMar>
+              <w:top w:type="dxa" w:w="80"/>
+              <w:left w:type="dxa" w:w="120"/>
+              <w:bottom w:type="dxa" w:w="80"/>
+              <w:right w:type="dxa" w:w="120"/>
+            </w:tcMar>
+          </w:tcPr>
+          <w:p>
+            <w:r>
+              <w:rPr>
+                <w:b w:val="false"/>
+                <w:bCs w:val="false"/>
+                <w:color w:val="222222"/>
+                <w:sz w:val="20"/>
+                <w:szCs w:val="20"/>
+              </w:rPr>
+              <w:t xml:space="preserve">Cuadrícula de resultados, antes y después de UPDATE y DELETE</w:t>
+            </w:r>
+          </w:p>
+        </w:tc>
+      </w:tr>
+      <w:tr>
+        <w:trPr>
+          <w:cantSplit/>
+          <w:tblHeader w:val="false"/>
+        </w:trPr>
+        <w:tc>
+          <w:tcPr>
+            <w:tcW w:type="dxa" w:w="2400"/>
+            <w:tcBorders>
+              <w:top w:val="single" w:color="C9D1E3" w:sz="4"/>
+              <w:left w:val="single" w:color="C9D1E3" w:sz="4"/>
+              <w:bottom w:val="single" w:color="C9D1E3" w:sz="4"/>
+              <w:right w:val="single" w:color="C9D1E3" w:sz="4"/>
+            </w:tcBorders>
+            <w:shd w:fill="F2F5FB" w:val="clear"/>
+            <w:tcMar>
+              <w:top w:type="dxa" w:w="80"/>
+              <w:left w:type="dxa" w:w="120"/>
+              <w:bottom w:type="dxa" w:w="80"/>
+              <w:right w:type="dxa" w:w="120"/>
+            </w:tcMar>
+          </w:tcPr>
+          <w:p>
+            <w:r>
+              <w:rPr>
+                <w:b w:val="false"/>
+                <w:bCs w:val="false"/>
+                <w:color w:val="222222"/>
+                <w:sz w:val="20"/>
+                <w:szCs w:val="20"/>
+              </w:rPr>
+              <w:t xml:space="preserve">Resultado de JOIN, agrupaciones y window functions</w:t>
+            </w:r>
+          </w:p>
+        </w:tc>
+        <w:tc>
+          <w:tcPr>
+            <w:tcW w:type="dxa" w:w="7238"/>
+            <w:tcBorders>
+              <w:top w:val="single" w:color="C9D1E3" w:sz="4"/>
+              <w:left w:val="single" w:color="C9D1E3" w:sz="4"/>
+              <w:bottom w:val="single" w:color="C9D1E3" w:sz="4"/>
+              <w:right w:val="single" w:color="C9D1E3" w:sz="4"/>
+            </w:tcBorders>
+            <w:shd w:fill="F2F5FB" w:val="clear"/>
+            <w:tcMar>
+              <w:top w:type="dxa" w:w="80"/>
+              <w:left w:type="dxa" w:w="120"/>
+              <w:bottom w:type="dxa" w:w="80"/>
+              <w:right w:type="dxa" w:w="120"/>
+            </w:tcMar>
+          </w:tcPr>
+          <w:p>
+            <w:r>
+              <w:rPr>
+                <w:b w:val="false"/>
+                <w:bCs w:val="false"/>
+                <w:color w:val="222222"/>
+                <w:sz w:val="20"/>
+                <w:szCs w:val="20"/>
+              </w:rPr>
+              <w:t xml:space="preserve">Tablas de origen y resultado lado a lado, con las filas coincidentes resaltadas</w:t>
+            </w:r>
+          </w:p>
+        </w:tc>
+      </w:tr>
+      <w:tr>
+        <w:trPr>
+          <w:cantSplit/>
+          <w:tblHeader w:val="false"/>
+        </w:trPr>
+        <w:tc>
+          <w:tcPr>
+            <w:tcW w:type="dxa" w:w="2400"/>
+            <w:tcBorders>
+              <w:top w:val="single" w:color="C9D1E3" w:sz="4"/>
+              <w:left w:val="single" w:color="C9D1E3" w:sz="4"/>
+              <w:bottom w:val="single" w:color="C9D1E3" w:sz="4"/>
+              <w:right w:val="single" w:color="C9D1E3" w:sz="4"/>
+            </w:tcBorders>
+            <w:tcMar>
+              <w:top w:type="dxa" w:w="80"/>
+              <w:left w:type="dxa" w:w="120"/>
+              <w:bottom w:type="dxa" w:w="80"/>
+              <w:right w:type="dxa" w:w="120"/>
+            </w:tcMar>
+          </w:tcPr>
+          <w:p>
+            <w:r>
+              <w:rPr>
+                <w:b w:val="false"/>
+                <w:bCs w:val="false"/>
+                <w:color w:val="222222"/>
+                <w:sz w:val="20"/>
+                <w:szCs w:val="20"/>
+              </w:rPr>
+              <w:t xml:space="preserve">Plan de ejecución (EXPLAIN)</w:t>
+            </w:r>
+          </w:p>
+        </w:tc>
+        <w:tc>
+          <w:tcPr>
+            <w:tcW w:type="dxa" w:w="7238"/>
+            <w:tcBorders>
+              <w:top w:val="single" w:color="C9D1E3" w:sz="4"/>
+              <w:left w:val="single" w:color="C9D1E3" w:sz="4"/>
+              <w:bottom w:val="single" w:color="C9D1E3" w:sz="4"/>
+              <w:right w:val="single" w:color="C9D1E3" w:sz="4"/>
+            </w:tcBorders>
+            <w:tcMar>
+              <w:top w:type="dxa" w:w="80"/>
+              <w:left w:type="dxa" w:w="120"/>
+              <w:bottom w:type="dxa" w:w="80"/>
+              <w:right w:type="dxa" w:w="120"/>
+            </w:tcMar>
+          </w:tcPr>
+          <w:p>
+            <w:r>
+              <w:rPr>
+                <w:b w:val="false"/>
+                <w:bCs w:val="false"/>
+                <w:color w:val="222222"/>
+                <w:sz w:val="20"/>
+                <w:szCs w:val="20"/>
+              </w:rPr>
+              <w:t xml:space="preserve">Plan en forma de árbol, antes y después de crear un índice</w:t>
+            </w:r>
+          </w:p>
+        </w:tc>
+      </w:tr>
+      <w:tr>
+        <w:trPr>
+          <w:cantSplit/>
+          <w:tblHeader w:val="false"/>
+        </w:trPr>
+        <w:tc>
+          <w:tcPr>
+            <w:tcW w:type="dxa" w:w="2400"/>
+            <w:tcBorders>
+              <w:top w:val="single" w:color="C9D1E3" w:sz="4"/>
+              <w:left w:val="single" w:color="C9D1E3" w:sz="4"/>
+              <w:bottom w:val="single" w:color="C9D1E3" w:sz="4"/>
+              <w:right w:val="single" w:color="C9D1E3" w:sz="4"/>
+            </w:tcBorders>
+            <w:shd w:fill="F2F5FB" w:val="clear"/>
+            <w:tcMar>
+              <w:top w:type="dxa" w:w="80"/>
+              <w:left w:type="dxa" w:w="120"/>
+              <w:bottom w:type="dxa" w:w="80"/>
+              <w:right w:type="dxa" w:w="120"/>
+            </w:tcMar>
+          </w:tcPr>
+          <w:p>
+            <w:r>
+              <w:rPr>
+                <w:b w:val="false"/>
+                <w:bCs w:val="false"/>
+                <w:color w:val="222222"/>
+                <w:sz w:val="20"/>
+                <w:szCs w:val="20"/>
+              </w:rPr>
+              <w:t xml:space="preserve">Usuarios, roles y permisos</w:t>
+            </w:r>
+          </w:p>
+        </w:tc>
+        <w:tc>
+          <w:tcPr>
+            <w:tcW w:type="dxa" w:w="7238"/>
+            <w:tcBorders>
+              <w:top w:val="single" w:color="C9D1E3" w:sz="4"/>
+              <w:left w:val="single" w:color="C9D1E3" w:sz="4"/>
+              <w:bottom w:val="single" w:color="C9D1E3" w:sz="4"/>
+              <w:right w:val="single" w:color="C9D1E3" w:sz="4"/>
+            </w:tcBorders>
+            <w:shd w:fill="F2F5FB" w:val="clear"/>
+            <w:tcMar>
+              <w:top w:type="dxa" w:w="80"/>
+              <w:left w:type="dxa" w:w="120"/>
+              <w:bottom w:type="dxa" w:w="80"/>
+              <w:right w:type="dxa" w:w="120"/>
+            </w:tcMar>
+          </w:tcPr>
+          <w:p>
+            <w:r>
+              <w:rPr>
+                <w:b w:val="false"/>
+                <w:bCs w:val="false"/>
+                <w:color w:val="222222"/>
+                <w:sz w:val="20"/>
+                <w:szCs w:val="20"/>
+              </w:rPr>
+              <w:t xml:space="preserve">Pantalla de roles y permisos, y el mensaje de error cuando se deniega un acceso</w:t>
+            </w:r>
+          </w:p>
+        </w:tc>
+      </w:tr>
+      <w:tr>
+        <w:trPr>
+          <w:cantSplit/>
+          <w:tblHeader w:val="false"/>
+        </w:trPr>
+        <w:tc>
+          <w:tcPr>
+            <w:tcW w:type="dxa" w:w="2400"/>
+            <w:tcBorders>
+              <w:top w:val="single" w:color="C9D1E3" w:sz="4"/>
+              <w:left w:val="single" w:color="C9D1E3" w:sz="4"/>
+              <w:bottom w:val="single" w:color="C9D1E3" w:sz="4"/>
+              <w:right w:val="single" w:color="C9D1E3" w:sz="4"/>
+            </w:tcBorders>
+            <w:tcMar>
+              <w:top w:type="dxa" w:w="80"/>
+              <w:left w:type="dxa" w:w="120"/>
+              <w:bottom w:type="dxa" w:w="80"/>
+              <w:right w:type="dxa" w:w="120"/>
+            </w:tcMar>
+          </w:tcPr>
+          <w:p>
+            <w:r>
+              <w:rPr>
+                <w:b w:val="false"/>
+                <w:bCs w:val="false"/>
+                <w:color w:val="222222"/>
+                <w:sz w:val="20"/>
+                <w:szCs w:val="20"/>
+              </w:rPr>
+              <w:t xml:space="preserve">Terminal, SSH y VPS</w:t>
+            </w:r>
+          </w:p>
+        </w:tc>
+        <w:tc>
+          <w:tcPr>
+            <w:tcW w:type="dxa" w:w="7238"/>
+            <w:tcBorders>
+              <w:top w:val="single" w:color="C9D1E3" w:sz="4"/>
+              <w:left w:val="single" w:color="C9D1E3" w:sz="4"/>
+              <w:bottom w:val="single" w:color="C9D1E3" w:sz="4"/>
+              <w:right w:val="single" w:color="C9D1E3" w:sz="4"/>
+            </w:tcBorders>
+            <w:tcMar>
+              <w:top w:type="dxa" w:w="80"/>
+              <w:left w:type="dxa" w:w="120"/>
+              <w:bottom w:type="dxa" w:w="80"/>
+              <w:right w:type="dxa" w:w="120"/>
+            </w:tcMar>
+          </w:tcPr>
+          <w:p>
+            <w:r>
+              <w:rPr>
+                <w:b w:val="false"/>
+                <w:bCs w:val="false"/>
+                <w:color w:val="222222"/>
+                <w:sz w:val="20"/>
+                <w:szCs w:val="20"/>
+              </w:rPr>
+              <w:t xml:space="preserve">Captura de la terminal con cada comando y su salida</w:t>
+            </w:r>
+          </w:p>
+        </w:tc>
+      </w:tr>
+      <w:tr>
+        <w:trPr>
+          <w:cantSplit/>
+          <w:tblHeader w:val="false"/>
+        </w:trPr>
+        <w:tc>
+          <w:tcPr>
+            <w:tcW w:type="dxa" w:w="2400"/>
+            <w:tcBorders>
+              <w:top w:val="single" w:color="C9D1E3" w:sz="4"/>
+              <w:left w:val="single" w:color="C9D1E3" w:sz="4"/>
+              <w:bottom w:val="single" w:color="C9D1E3" w:sz="4"/>
+              <w:right w:val="single" w:color="C9D1E3" w:sz="4"/>
+            </w:tcBorders>
+            <w:shd w:fill="F2F5FB" w:val="clear"/>
+            <w:tcMar>
+              <w:top w:type="dxa" w:w="80"/>
+              <w:left w:type="dxa" w:w="120"/>
+              <w:bottom w:type="dxa" w:w="80"/>
+              <w:right w:type="dxa" w:w="120"/>
+            </w:tcMar>
+          </w:tcPr>
+          <w:p>
+            <w:r>
+              <w:rPr>
+                <w:b w:val="false"/>
+                <w:bCs w:val="false"/>
+                <w:color w:val="222222"/>
+                <w:sz w:val="20"/>
+                <w:szCs w:val="20"/>
+              </w:rPr>
+              <w:t xml:space="preserve">Supabase, Firebase y Airtable</w:t>
+            </w:r>
+          </w:p>
+        </w:tc>
+        <w:tc>
+          <w:tcPr>
+            <w:tcW w:type="dxa" w:w="7238"/>
+            <w:tcBorders>
+              <w:top w:val="single" w:color="C9D1E3" w:sz="4"/>
+              <w:left w:val="single" w:color="C9D1E3" w:sz="4"/>
+              <w:bottom w:val="single" w:color="C9D1E3" w:sz="4"/>
+              <w:right w:val="single" w:color="C9D1E3" w:sz="4"/>
+            </w:tcBorders>
+            <w:shd w:fill="F2F5FB" w:val="clear"/>
+            <w:tcMar>
+              <w:top w:type="dxa" w:w="80"/>
+              <w:left w:type="dxa" w:w="120"/>
+              <w:bottom w:type="dxa" w:w="80"/>
+              <w:right w:type="dxa" w:w="120"/>
+            </w:tcMar>
+          </w:tcPr>
+          <w:p>
+            <w:r>
+              <w:rPr>
+                <w:b w:val="false"/>
+                <w:bCs w:val="false"/>
+                <w:color w:val="222222"/>
+                <w:sz w:val="20"/>
+                <w:szCs w:val="20"/>
+              </w:rPr>
+              <w:t xml:space="preserve">Pantalla de la plataforma: editor de tablas, reglas, vistas y registros enlazados</w:t>
+            </w:r>
+          </w:p>
+        </w:tc>
+      </w:tr>
+      <w:tr>
+        <w:trPr>
+          <w:cantSplit/>
+          <w:tblHeader w:val="false"/>
+        </w:trPr>
+        <w:tc>
+          <w:tcPr>
+            <w:tcW w:type="dxa" w:w="2400"/>
+            <w:tcBorders>
+              <w:top w:val="single" w:color="C9D1E3" w:sz="4"/>
+              <w:left w:val="single" w:color="C9D1E3" w:sz="4"/>
+              <w:bottom w:val="single" w:color="C9D1E3" w:sz="4"/>
+              <w:right w:val="single" w:color="C9D1E3" w:sz="4"/>
+            </w:tcBorders>
+            <w:tcMar>
+              <w:top w:type="dxa" w:w="80"/>
+              <w:left w:type="dxa" w:w="120"/>
+              <w:bottom w:type="dxa" w:w="80"/>
+              <w:right w:type="dxa" w:w="120"/>
+            </w:tcMar>
+          </w:tcPr>
+          <w:p>
+            <w:r>
+              <w:rPr>
+                <w:b w:val="false"/>
+                <w:bCs w:val="false"/>
+                <w:color w:val="222222"/>
+                <w:sz w:val="20"/>
+                <w:szCs w:val="20"/>
+              </w:rPr>
+              <w:t xml:space="preserve">API, React y React Native</w:t>
+            </w:r>
+          </w:p>
+        </w:tc>
+        <w:tc>
+          <w:tcPr>
+            <w:tcW w:type="dxa" w:w="7238"/>
+            <w:tcBorders>
+              <w:top w:val="single" w:color="C9D1E3" w:sz="4"/>
+              <w:left w:val="single" w:color="C9D1E3" w:sz="4"/>
+              <w:bottom w:val="single" w:color="C9D1E3" w:sz="4"/>
+              <w:right w:val="single" w:color="C9D1E3" w:sz="4"/>
+            </w:tcBorders>
+            <w:tcMar>
+              <w:top w:type="dxa" w:w="80"/>
+              <w:left w:type="dxa" w:w="120"/>
+              <w:bottom w:type="dxa" w:w="80"/>
+              <w:right w:type="dxa" w:w="120"/>
+            </w:tcMar>
+          </w:tcPr>
+          <w:p>
+            <w:r>
+              <w:rPr>
+                <w:b w:val="false"/>
+                <w:bCs w:val="false"/>
+                <w:color w:val="222222"/>
+                <w:sz w:val="20"/>
+                <w:szCs w:val="20"/>
+              </w:rPr>
+              <w:t xml:space="preserve">Respuesta JSON de la API y pantalla de la aplicación web y móvil con los datos</w:t>
+            </w:r>
+          </w:p>
+        </w:tc>
+      </w:tr>
+      <w:tr>
+        <w:trPr>
+          <w:cantSplit/>
+          <w:tblHeader w:val="false"/>
+        </w:trPr>
+        <w:tc>
+          <w:tcPr>
+            <w:tcW w:type="dxa" w:w="2400"/>
+            <w:tcBorders>
+              <w:top w:val="single" w:color="C9D1E3" w:sz="4"/>
+              <w:left w:val="single" w:color="C9D1E3" w:sz="4"/>
+              <w:bottom w:val="single" w:color="C9D1E3" w:sz="4"/>
+              <w:right w:val="single" w:color="C9D1E3" w:sz="4"/>
+            </w:tcBorders>
+            <w:shd w:fill="F2F5FB" w:val="clear"/>
+            <w:tcMar>
+              <w:top w:type="dxa" w:w="80"/>
+              <w:left w:type="dxa" w:w="120"/>
+              <w:bottom w:type="dxa" w:w="80"/>
+              <w:right w:type="dxa" w:w="120"/>
+            </w:tcMar>
+          </w:tcPr>
+          <w:p>
+            <w:r>
+              <w:rPr>
+                <w:b w:val="false"/>
+                <w:bCs w:val="false"/>
+                <w:color w:val="222222"/>
+                <w:sz w:val="20"/>
+                <w:szCs w:val="20"/>
+              </w:rPr>
+              <w:t xml:space="preserve">n8n</w:t>
+            </w:r>
+          </w:p>
+        </w:tc>
+        <w:tc>
+          <w:tcPr>
+            <w:tcW w:type="dxa" w:w="7238"/>
+            <w:tcBorders>
+              <w:top w:val="single" w:color="C9D1E3" w:sz="4"/>
+              <w:left w:val="single" w:color="C9D1E3" w:sz="4"/>
+              <w:bottom w:val="single" w:color="C9D1E3" w:sz="4"/>
+              <w:right w:val="single" w:color="C9D1E3" w:sz="4"/>
+            </w:tcBorders>
+            <w:shd w:fill="F2F5FB" w:val="clear"/>
+            <w:tcMar>
+              <w:top w:type="dxa" w:w="80"/>
+              <w:left w:type="dxa" w:w="120"/>
+              <w:bottom w:type="dxa" w:w="80"/>
+              <w:right w:type="dxa" w:w="120"/>
+            </w:tcMar>
+          </w:tcPr>
+          <w:p>
+            <w:r>
+              <w:rPr>
+                <w:b w:val="false"/>
+                <w:bCs w:val="false"/>
+                <w:color w:val="222222"/>
+                <w:sz w:val="20"/>
+                <w:szCs w:val="20"/>
+              </w:rPr>
+              <w:t xml:space="preserve">Flujo de nodos con su ejecución correcta</w:t>
+            </w:r>
+          </w:p>
+        </w:tc>
+      </w:tr>
+      <w:tr>
+        <w:trPr>
+          <w:cantSplit/>
+          <w:tblHeader w:val="false"/>
+        </w:trPr>
+        <w:tc>
+          <w:tcPr>
+            <w:tcW w:type="dxa" w:w="2400"/>
+            <w:tcBorders>
+              <w:top w:val="single" w:color="C9D1E3" w:sz="4"/>
+              <w:left w:val="single" w:color="C9D1E3" w:sz="4"/>
+              <w:bottom w:val="single" w:color="C9D1E3" w:sz="4"/>
+              <w:right w:val="single" w:color="C9D1E3" w:sz="4"/>
+            </w:tcBorders>
+            <w:tcMar>
+              <w:top w:type="dxa" w:w="80"/>
+              <w:left w:type="dxa" w:w="120"/>
+              <w:bottom w:type="dxa" w:w="80"/>
+              <w:right w:type="dxa" w:w="120"/>
+            </w:tcMar>
+          </w:tcPr>
+          <w:p>
+            <w:r>
+              <w:rPr>
+                <w:b w:val="false"/>
+                <w:bCs w:val="false"/>
+                <w:color w:val="222222"/>
+                <w:sz w:val="20"/>
+                <w:szCs w:val="20"/>
+              </w:rPr>
+              <w:t xml:space="preserve">Backups y restauración</w:t>
+            </w:r>
+          </w:p>
+        </w:tc>
+        <w:tc>
+          <w:tcPr>
+            <w:tcW w:type="dxa" w:w="7238"/>
+            <w:tcBorders>
+              <w:top w:val="single" w:color="C9D1E3" w:sz="4"/>
+              <w:left w:val="single" w:color="C9D1E3" w:sz="4"/>
+              <w:bottom w:val="single" w:color="C9D1E3" w:sz="4"/>
+              <w:right w:val="single" w:color="C9D1E3" w:sz="4"/>
+            </w:tcBorders>
+            <w:tcMar>
+              <w:top w:type="dxa" w:w="80"/>
+              <w:left w:type="dxa" w:w="120"/>
+              <w:bottom w:type="dxa" w:w="80"/>
+              <w:right w:type="dxa" w:w="120"/>
+            </w:tcMar>
+          </w:tcPr>
+          <w:p>
+            <w:r>
+              <w:rPr>
+                <w:b w:val="false"/>
+                <w:bCs w:val="false"/>
+                <w:color w:val="222222"/>
+                <w:sz w:val="20"/>
+                <w:szCs w:val="20"/>
+              </w:rPr>
+              <w:t xml:space="preserve">Salida de la copia y de la restauración, y comprobación de los datos recuperados</w:t>
+            </w:r>
+          </w:p>
+        </w:tc>
+      </w:tr>
+      <w:tr>
+        <w:trPr>
+          <w:cantSplit/>
+          <w:tblHeader w:val="false"/>
+        </w:trPr>
+        <w:tc>
+          <w:tcPr>
+            <w:tcW w:type="dxa" w:w="2400"/>
+            <w:tcBorders>
+              <w:top w:val="single" w:color="C9D1E3" w:sz="4"/>
+              <w:left w:val="single" w:color="C9D1E3" w:sz="4"/>
+              <w:bottom w:val="single" w:color="C9D1E3" w:sz="4"/>
+              <w:right w:val="single" w:color="C9D1E3" w:sz="4"/>
+            </w:tcBorders>
+            <w:shd w:fill="F2F5FB" w:val="clear"/>
+            <w:tcMar>
+              <w:top w:type="dxa" w:w="80"/>
+              <w:left w:type="dxa" w:w="120"/>
+              <w:bottom w:type="dxa" w:w="80"/>
+              <w:right w:type="dxa" w:w="120"/>
+            </w:tcMar>
+          </w:tcPr>
+          <w:p>
+            <w:r>
+              <w:rPr>
+                <w:b w:val="false"/>
+                <w:bCs w:val="false"/>
+                <w:color w:val="222222"/>
+                <w:sz w:val="20"/>
+                <w:szCs w:val="20"/>
+              </w:rPr>
+              <w:t xml:space="preserve">Proyectos</w:t>
+            </w:r>
+          </w:p>
+        </w:tc>
+        <w:tc>
+          <w:tcPr>
+            <w:tcW w:type="dxa" w:w="7238"/>
+            <w:tcBorders>
+              <w:top w:val="single" w:color="C9D1E3" w:sz="4"/>
+              <w:left w:val="single" w:color="C9D1E3" w:sz="4"/>
+              <w:bottom w:val="single" w:color="C9D1E3" w:sz="4"/>
+              <w:right w:val="single" w:color="C9D1E3" w:sz="4"/>
+            </w:tcBorders>
+            <w:shd w:fill="F2F5FB" w:val="clear"/>
+            <w:tcMar>
+              <w:top w:type="dxa" w:w="80"/>
+              <w:left w:type="dxa" w:w="120"/>
+              <w:bottom w:type="dxa" w:w="80"/>
+              <w:right w:type="dxa" w:w="120"/>
+            </w:tcMar>
+          </w:tcPr>
+          <w:p>
+            <w:r>
+              <w:rPr>
+                <w:b w:val="false"/>
+                <w:bCs w:val="false"/>
+                <w:color w:val="222222"/>
+                <w:sz w:val="20"/>
+                <w:szCs w:val="20"/>
+              </w:rPr>
+              <w:t xml:space="preserve">Secuencia de capturas por fase, con el estado de la base de datos y de la aplicación</w:t>
+            </w:r>
+          </w:p>
+        </w:tc>
+      </w:tr>
+    </w:tbl>
+    <w:p>
+      <w:pPr>
+        <w:spacing w:after="120"/>
+      </w:pPr>
+    </w:p>
+    <w:p>
+      <w:pPr>
+        <w:spacing w:after="120" w:line="300"/>
+      </w:pPr>
+      <w:r>
+        <w:rPr>
+          <w:color w:val="222222"/>
+          <w:sz w:val="22"/>
+          <w:szCs w:val="22"/>
+        </w:rPr>
+        <w:t xml:space="preserve">La numeración será fija (Figura 5.3-a, 5.3-b...) y todas las figuras se recogerán en el Anexo H.</w:t>
+      </w:r>
+    </w:p>
+    <w:p>
+      <w:pPr>
         <w:pStyle w:val="Heading1"/>
         <w:pageBreakBefore/>
         <w:pBdr>
@@ -11079,6 +12043,19 @@
     </w:p>
     <w:p>
       <w:pPr>
+        <w:spacing w:after="120" w:line="300"/>
+      </w:pPr>
+      <w:r>
+        <w:rPr>
+          <w:color w:val="222222"/>
+          <w:sz w:val="22"/>
+          <w:szCs w:val="22"/>
+        </w:rPr>
+        <w:t xml:space="preserve">H. Índice de figuras: todas las imágenes de resultados, numeradas y enlazadas con su ejemplo.</w:t>
+      </w:r>
+    </w:p>
+    <w:p>
+      <w:pPr>
         <w:pStyle w:val="Heading1"/>
         <w:pageBreakBefore/>
         <w:pBdr>
@@ -12392,7 +13369,7 @@
                 <w:sz w:val="20"/>
                 <w:szCs w:val="20"/>
               </w:rPr>
-              <w:t xml:space="preserve">Plantilla didáctica de 11 pasos</w:t>
+              <w:t xml:space="preserve">Plantilla didáctica de 12 pasos</w:t>
             </w:r>
           </w:p>
         </w:tc>
@@ -12422,6 +13399,72 @@
                 <w:szCs w:val="20"/>
               </w:rPr>
               <w:t xml:space="preserve">Cómo usar este manual (aplicada en todas las partes)</w:t>
+            </w:r>
+          </w:p>
+        </w:tc>
+      </w:tr>
+      <w:tr>
+        <w:trPr>
+          <w:cantSplit/>
+          <w:tblHeader w:val="false"/>
+        </w:trPr>
+        <w:tc>
+          <w:tcPr>
+            <w:tcW w:type="dxa" w:w="2400"/>
+            <w:tcBorders>
+              <w:top w:val="single" w:color="C9D1E3" w:sz="4"/>
+              <w:left w:val="single" w:color="C9D1E3" w:sz="4"/>
+              <w:bottom w:val="single" w:color="C9D1E3" w:sz="4"/>
+              <w:right w:val="single" w:color="C9D1E3" w:sz="4"/>
+            </w:tcBorders>
+            <w:shd w:fill="F2F5FB" w:val="clear"/>
+            <w:tcMar>
+              <w:top w:type="dxa" w:w="80"/>
+              <w:left w:type="dxa" w:w="120"/>
+              <w:bottom w:type="dxa" w:w="80"/>
+              <w:right w:type="dxa" w:w="120"/>
+            </w:tcMar>
+          </w:tcPr>
+          <w:p>
+            <w:r>
+              <w:rPr>
+                <w:b w:val="false"/>
+                <w:bCs w:val="false"/>
+                <w:color w:val="222222"/>
+                <w:sz w:val="20"/>
+                <w:szCs w:val="20"/>
+              </w:rPr>
+              <w:t xml:space="preserve">Ejemplos de código con imagen del resultado en la interfaz</w:t>
+            </w:r>
+          </w:p>
+        </w:tc>
+        <w:tc>
+          <w:tcPr>
+            <w:tcW w:type="dxa" w:w="7238"/>
+            <w:tcBorders>
+              <w:top w:val="single" w:color="C9D1E3" w:sz="4"/>
+              <w:left w:val="single" w:color="C9D1E3" w:sz="4"/>
+              <w:bottom w:val="single" w:color="C9D1E3" w:sz="4"/>
+              <w:right w:val="single" w:color="C9D1E3" w:sz="4"/>
+            </w:tcBorders>
+            <w:shd w:fill="F2F5FB" w:val="clear"/>
+            <w:tcMar>
+              <w:top w:type="dxa" w:w="80"/>
+              <w:left w:type="dxa" w:w="120"/>
+              <w:bottom w:type="dxa" w:w="80"/>
+              <w:right w:type="dxa" w:w="120"/>
+            </w:tcMar>
+          </w:tcPr>
+          <w:p>
+            <w:r>
+              <w:rPr>
+                <w:b w:val="false"/>
+                <w:bCs w:val="false"/>
+                <w:color w:val="222222"/>
+                <w:sz w:val="20"/>
+                <w:szCs w:val="20"/>
+              </w:rPr>
+              <w:t xml:space="preserve">Política de ejemplos visuales, todas las partes y Anexo H</w:t>
             </w:r>
           </w:p>
         </w:tc>
@@ -12573,6 +13616,32 @@
           <w:szCs w:val="22"/>
         </w:rPr>
         <w:t xml:space="preserve">5.	</w:t>
+      </w:r>
+      <w:r>
+        <w:rPr>
+          <w:sz w:val="22"/>
+          <w:szCs w:val="22"/>
+        </w:rPr>
+        <w:t xml:space="preserve">Imágenes de resultados: donde la herramienta pueda ejecutarse en el entorno de trabajo (por ejemplo PostgreSQL con un cliente gráfico), las imágenes serán capturas reales de lo ejecutado. Donde no pueda (por ejemplo plataformas de terceros con cuenta propia), serán maquetas fieles, rotuladas como tales; no se presentará una maqueta como captura real.</w:t>
+      </w:r>
+    </w:p>
+    <w:p>
+      <w:pPr>
+        <w:tabs>
+          <w:tab w:val="left" w:pos="540"/>
+        </w:tabs>
+        <w:spacing w:after="60"/>
+        <w:ind w:left="540" w:hanging="540"/>
+      </w:pPr>
+      <w:r>
+        <w:rPr>
+          <w:b/>
+          <w:bCs/>
+          <w:color w:val="FF7A1A"/>
+          <w:sz w:val="22"/>
+          <w:szCs w:val="22"/>
+        </w:rPr>
+        <w:t xml:space="preserve">6.	</w:t>
       </w:r>
       <w:r>
         <w:rPr>

</xml_diff>